<commit_message>
feat: add Excel generation services for CMR and TIR documents with support for customizable templates
</commit_message>
<xml_diff>
--- a/backend/templates/CMR template.docx
+++ b/backend/templates/CMR template.docx
@@ -2368,58 +2368,176 @@
               <w:rPr>
                 <w:rFonts w:ascii="Arial" w:hAnsi="Arial" w:cs="Arial"/>
                 <w:b/>
-                <w:lang w:val="en-US"/>
-              </w:rPr>
-            </w:pPr>
-            <w:r>
-              <w:rPr>
-                <w:rFonts w:ascii="Arial" w:hAnsi="Arial" w:cs="Arial"/>
-                <w:b/>
-                <w:sz w:val="16"/>
-                <w:szCs w:val="16"/>
-                <w:lang w:val="en-US"/>
+                <w:sz w:val="14"/>
+                <w:szCs w:val="14"/>
+              </w:rPr>
+            </w:pPr>
+            <w:r>
+              <w:rPr>
+                <w:rFonts w:ascii="Arial" w:hAnsi="Arial" w:cs="Arial"/>
+                <w:b/>
+                <w:sz w:val="14"/>
+                <w:szCs w:val="14"/>
+              </w:rPr>
+              <w:t xml:space="preserve">г. Омск, </w:t>
+            </w:r>
+            <w:proofErr w:type="spellStart"/>
+            <w:r>
+              <w:rPr>
+                <w:rFonts w:ascii="Arial" w:hAnsi="Arial" w:cs="Arial"/>
+                <w:b/>
+                <w:sz w:val="14"/>
+                <w:szCs w:val="14"/>
+              </w:rPr>
+              <w:t>г.Самара</w:t>
+            </w:r>
+            <w:proofErr w:type="spellEnd"/>
+            <w:r>
+              <w:rPr>
+                <w:rFonts w:ascii="Arial" w:hAnsi="Arial" w:cs="Arial"/>
+                <w:b/>
+                <w:sz w:val="14"/>
+                <w:szCs w:val="14"/>
+              </w:rPr>
+              <w:t xml:space="preserve">, </w:t>
+            </w:r>
+            <w:proofErr w:type="spellStart"/>
+            <w:r>
+              <w:rPr>
+                <w:rFonts w:ascii="Arial" w:hAnsi="Arial" w:cs="Arial"/>
+                <w:b/>
+                <w:sz w:val="14"/>
+                <w:szCs w:val="14"/>
+              </w:rPr>
+              <w:t>г.Оренбург</w:t>
+            </w:r>
+            <w:proofErr w:type="spellEnd"/>
+            <w:r>
+              <w:rPr>
+                <w:rFonts w:ascii="Arial" w:hAnsi="Arial" w:cs="Arial"/>
+                <w:b/>
+                <w:sz w:val="14"/>
+                <w:szCs w:val="14"/>
+              </w:rPr>
+              <w:t xml:space="preserve">, </w:t>
+            </w:r>
+            <w:proofErr w:type="spellStart"/>
+            <w:r>
+              <w:rPr>
+                <w:rFonts w:ascii="Arial" w:hAnsi="Arial" w:cs="Arial"/>
+                <w:b/>
+                <w:sz w:val="14"/>
+                <w:szCs w:val="14"/>
+              </w:rPr>
+              <w:t>г.Москва</w:t>
+            </w:r>
+            <w:proofErr w:type="spellEnd"/>
+            <w:r>
+              <w:rPr>
+                <w:rFonts w:ascii="Arial" w:hAnsi="Arial" w:cs="Arial"/>
+                <w:b/>
+                <w:sz w:val="14"/>
+                <w:szCs w:val="14"/>
+              </w:rPr>
+              <w:t xml:space="preserve">, </w:t>
+            </w:r>
+            <w:proofErr w:type="spellStart"/>
+            <w:r>
+              <w:rPr>
+                <w:rFonts w:ascii="Arial" w:hAnsi="Arial" w:cs="Arial"/>
+                <w:b/>
+                <w:sz w:val="14"/>
+                <w:szCs w:val="14"/>
+              </w:rPr>
+              <w:t>г.Пенза</w:t>
+            </w:r>
+            <w:proofErr w:type="spellEnd"/>
+            <w:r>
+              <w:rPr>
+                <w:rFonts w:ascii="Arial" w:hAnsi="Arial" w:cs="Arial"/>
+                <w:b/>
+                <w:sz w:val="14"/>
+                <w:szCs w:val="14"/>
+              </w:rPr>
+              <w:t xml:space="preserve">, </w:t>
+            </w:r>
+            <w:proofErr w:type="spellStart"/>
+            <w:r>
+              <w:rPr>
+                <w:rFonts w:ascii="Arial" w:hAnsi="Arial" w:cs="Arial"/>
+                <w:b/>
+                <w:sz w:val="14"/>
+                <w:szCs w:val="14"/>
+              </w:rPr>
+              <w:t>г.Казань</w:t>
+            </w:r>
+            <w:proofErr w:type="spellEnd"/>
+            <w:r>
+              <w:rPr>
+                <w:rFonts w:ascii="Arial" w:hAnsi="Arial" w:cs="Arial"/>
+                <w:b/>
+                <w:sz w:val="14"/>
+                <w:szCs w:val="14"/>
+              </w:rPr>
+              <w:t xml:space="preserve">, г. Челябинск, г. Астрахань, г. Пермь, г. Санкт- Петербург, Краснодар, Новосибирск, г. </w:t>
+            </w:r>
+            <w:proofErr w:type="spellStart"/>
+            <w:r>
+              <w:rPr>
+                <w:rFonts w:ascii="Arial" w:hAnsi="Arial" w:cs="Arial"/>
+                <w:b/>
+                <w:sz w:val="14"/>
+                <w:szCs w:val="14"/>
+              </w:rPr>
+              <w:t>Ростов</w:t>
+            </w:r>
+            <w:proofErr w:type="spellEnd"/>
+            <w:r>
+              <w:rPr>
+                <w:rFonts w:ascii="Arial" w:hAnsi="Arial" w:cs="Arial"/>
+                <w:b/>
+                <w:sz w:val="14"/>
+                <w:szCs w:val="14"/>
+              </w:rPr>
+              <w:t>, г. Екатеринбург и другие регионы Российской Федерации</w:t>
+            </w:r>
+            <w:r>
+              <w:rPr>
+                <w:rFonts w:ascii="Arial" w:hAnsi="Arial" w:cs="Arial"/>
+                <w:b/>
+                <w:sz w:val="14"/>
+                <w:szCs w:val="14"/>
+              </w:rPr>
+              <w:t xml:space="preserve"> </w:t>
+            </w:r>
+            <w:r>
+              <w:rPr>
+                <w:rFonts w:ascii="Arial" w:hAnsi="Arial" w:cs="Arial"/>
+                <w:b/>
+                <w:sz w:val="14"/>
+                <w:szCs w:val="14"/>
               </w:rPr>
               <w:t>$</w:t>
             </w:r>
+            <w:proofErr w:type="spellStart"/>
             <w:r>
               <w:rPr>
                 <w:rFonts w:ascii="Arial" w:hAnsi="Arial" w:cs="Arial"/>
                 <w:b/>
                 <w:bCs/>
-                <w:sz w:val="16"/>
-                <w:szCs w:val="16"/>
-              </w:rPr>
-              <w:t>Место</w:t>
-            </w:r>
+                <w:sz w:val="14"/>
+                <w:szCs w:val="14"/>
+              </w:rPr>
+              <w:t>Место_разгрузки</w:t>
+            </w:r>
+            <w:proofErr w:type="spellEnd"/>
             <w:r>
               <w:rPr>
                 <w:rFonts w:ascii="Arial" w:hAnsi="Arial" w:cs="Arial"/>
                 <w:b/>
                 <w:bCs/>
-                <w:sz w:val="16"/>
-                <w:szCs w:val="16"/>
-                <w:lang w:val="de-DE"/>
-              </w:rPr>
-              <w:t>_</w:t>
-            </w:r>
-            <w:r>
-              <w:rPr>
-                <w:rFonts w:ascii="Arial" w:hAnsi="Arial" w:cs="Arial"/>
-                <w:b/>
-                <w:bCs/>
-                <w:sz w:val="16"/>
-                <w:szCs w:val="16"/>
-              </w:rPr>
-              <w:t>разгрузки</w:t>
-            </w:r>
-            <w:r>
-              <w:rPr>
-                <w:rFonts w:ascii="Arial" w:hAnsi="Arial" w:cs="Arial"/>
-                <w:b/>
-                <w:bCs/>
-                <w:sz w:val="16"/>
-                <w:szCs w:val="16"/>
-                <w:lang w:val="en-US"/>
+                <w:sz w:val="14"/>
+                <w:szCs w:val="14"/>
               </w:rPr>
               <w:t>$</w:t>
             </w:r>
@@ -2444,7 +2562,6 @@
                 <w:rFonts w:ascii="Arial" w:hAnsi="Arial" w:cs="Arial"/>
                 <w:sz w:val="16"/>
                 <w:szCs w:val="16"/>
-                <w:lang w:val="en-US"/>
               </w:rPr>
             </w:pPr>
           </w:p>
@@ -13344,7 +13461,7 @@
       </w:tr>
       <w:tr>
         <w:trPr>
-          <w:trHeight w:hRule="exact" w:val="238"/>
+          <w:trHeight w:hRule="exact" w:val="168"/>
         </w:trPr>
         <w:tc>
           <w:tcPr>

</xml_diff>

<commit_message>
feat: add CMR document generation service and template file
</commit_message>
<xml_diff>
--- a/backend/templates/CMR template.docx
+++ b/backend/templates/CMR template.docx
@@ -2379,167 +2379,7 @@
                 <w:sz w:val="14"/>
                 <w:szCs w:val="14"/>
               </w:rPr>
-              <w:t xml:space="preserve">г. Омск, </w:t>
-            </w:r>
-            <w:proofErr w:type="spellStart"/>
-            <w:r>
-              <w:rPr>
-                <w:rFonts w:ascii="Arial" w:hAnsi="Arial" w:cs="Arial"/>
-                <w:b/>
-                <w:sz w:val="14"/>
-                <w:szCs w:val="14"/>
-              </w:rPr>
-              <w:t>г.Самара</w:t>
-            </w:r>
-            <w:proofErr w:type="spellEnd"/>
-            <w:r>
-              <w:rPr>
-                <w:rFonts w:ascii="Arial" w:hAnsi="Arial" w:cs="Arial"/>
-                <w:b/>
-                <w:sz w:val="14"/>
-                <w:szCs w:val="14"/>
-              </w:rPr>
-              <w:t xml:space="preserve">, </w:t>
-            </w:r>
-            <w:proofErr w:type="spellStart"/>
-            <w:r>
-              <w:rPr>
-                <w:rFonts w:ascii="Arial" w:hAnsi="Arial" w:cs="Arial"/>
-                <w:b/>
-                <w:sz w:val="14"/>
-                <w:szCs w:val="14"/>
-              </w:rPr>
-              <w:t>г.Оренбург</w:t>
-            </w:r>
-            <w:proofErr w:type="spellEnd"/>
-            <w:r>
-              <w:rPr>
-                <w:rFonts w:ascii="Arial" w:hAnsi="Arial" w:cs="Arial"/>
-                <w:b/>
-                <w:sz w:val="14"/>
-                <w:szCs w:val="14"/>
-              </w:rPr>
-              <w:t xml:space="preserve">, </w:t>
-            </w:r>
-            <w:proofErr w:type="spellStart"/>
-            <w:r>
-              <w:rPr>
-                <w:rFonts w:ascii="Arial" w:hAnsi="Arial" w:cs="Arial"/>
-                <w:b/>
-                <w:sz w:val="14"/>
-                <w:szCs w:val="14"/>
-              </w:rPr>
-              <w:t>г.Москва</w:t>
-            </w:r>
-            <w:proofErr w:type="spellEnd"/>
-            <w:r>
-              <w:rPr>
-                <w:rFonts w:ascii="Arial" w:hAnsi="Arial" w:cs="Arial"/>
-                <w:b/>
-                <w:sz w:val="14"/>
-                <w:szCs w:val="14"/>
-              </w:rPr>
-              <w:t xml:space="preserve">, </w:t>
-            </w:r>
-            <w:proofErr w:type="spellStart"/>
-            <w:r>
-              <w:rPr>
-                <w:rFonts w:ascii="Arial" w:hAnsi="Arial" w:cs="Arial"/>
-                <w:b/>
-                <w:sz w:val="14"/>
-                <w:szCs w:val="14"/>
-              </w:rPr>
-              <w:t>г.Пенза</w:t>
-            </w:r>
-            <w:proofErr w:type="spellEnd"/>
-            <w:r>
-              <w:rPr>
-                <w:rFonts w:ascii="Arial" w:hAnsi="Arial" w:cs="Arial"/>
-                <w:b/>
-                <w:sz w:val="14"/>
-                <w:szCs w:val="14"/>
-              </w:rPr>
-              <w:t xml:space="preserve">, </w:t>
-            </w:r>
-            <w:proofErr w:type="spellStart"/>
-            <w:r>
-              <w:rPr>
-                <w:rFonts w:ascii="Arial" w:hAnsi="Arial" w:cs="Arial"/>
-                <w:b/>
-                <w:sz w:val="14"/>
-                <w:szCs w:val="14"/>
-              </w:rPr>
-              <w:t>г.Казань</w:t>
-            </w:r>
-            <w:proofErr w:type="spellEnd"/>
-            <w:r>
-              <w:rPr>
-                <w:rFonts w:ascii="Arial" w:hAnsi="Arial" w:cs="Arial"/>
-                <w:b/>
-                <w:sz w:val="14"/>
-                <w:szCs w:val="14"/>
-              </w:rPr>
-              <w:t xml:space="preserve">, г. Челябинск, г. Астрахань, г. Пермь, г. Санкт- Петербург, Краснодар, Новосибирск, г. </w:t>
-            </w:r>
-            <w:proofErr w:type="spellStart"/>
-            <w:r>
-              <w:rPr>
-                <w:rFonts w:ascii="Arial" w:hAnsi="Arial" w:cs="Arial"/>
-                <w:b/>
-                <w:sz w:val="14"/>
-                <w:szCs w:val="14"/>
-              </w:rPr>
-              <w:t>Ростов</w:t>
-            </w:r>
-            <w:proofErr w:type="spellEnd"/>
-            <w:r>
-              <w:rPr>
-                <w:rFonts w:ascii="Arial" w:hAnsi="Arial" w:cs="Arial"/>
-                <w:b/>
-                <w:sz w:val="14"/>
-                <w:szCs w:val="14"/>
-              </w:rPr>
-              <w:t>, г. Екатеринбург и другие регионы Российской Федерации</w:t>
-            </w:r>
-            <w:r>
-              <w:rPr>
-                <w:rFonts w:ascii="Arial" w:hAnsi="Arial" w:cs="Arial"/>
-                <w:b/>
-                <w:sz w:val="14"/>
-                <w:szCs w:val="14"/>
-              </w:rPr>
-              <w:t xml:space="preserve"> </w:t>
-            </w:r>
-            <w:r>
-              <w:rPr>
-                <w:rFonts w:ascii="Arial" w:hAnsi="Arial" w:cs="Arial"/>
-                <w:b/>
-                <w:sz w:val="14"/>
-                <w:szCs w:val="14"/>
-              </w:rPr>
-              <w:t>$</w:t>
-            </w:r>
-            <w:proofErr w:type="spellStart"/>
-            <w:r>
-              <w:rPr>
-                <w:rFonts w:ascii="Arial" w:hAnsi="Arial" w:cs="Arial"/>
-                <w:b/>
-                <w:bCs/>
-                <w:sz w:val="14"/>
-                <w:szCs w:val="14"/>
-              </w:rPr>
-              <w:t>Место_разгрузки</w:t>
-            </w:r>
-            <w:proofErr w:type="spellEnd"/>
-            <w:r>
-              <w:rPr>
-                <w:rFonts w:ascii="Arial" w:hAnsi="Arial" w:cs="Arial"/>
-                <w:b/>
-                <w:bCs/>
-                <w:sz w:val="14"/>
-                <w:szCs w:val="14"/>
-              </w:rPr>
-              <w:t>$</w:t>
+              <w:t xml:space="preserve">$Место_разгрузки$</w:t>
             </w:r>
           </w:p>
         </w:tc>
@@ -5068,17 +4908,6 @@
                 <w:szCs w:val="16"/>
                 <w:lang w:val="de-DE"/>
               </w:rPr>
-              <w:t>)</w:t>
-            </w:r>
-            <w:r>
-              <w:rPr>
-                <w:rFonts w:ascii="Arial" w:hAnsi="Arial" w:cs="Arial"/>
-                <w:b/>
-                <w:bCs/>
-                <w:sz w:val="16"/>
-                <w:szCs w:val="16"/>
-                <w:lang w:val="de-DE"/>
-              </w:rPr>
               <w:t xml:space="preserve"> </w:t>
             </w:r>
             <w:r>
@@ -5230,16 +5059,6 @@
                 <w:lang w:val="de-DE"/>
               </w:rPr>
               <w:t xml:space="preserve"> </w:t>
-            </w:r>
-            <w:r>
-              <w:rPr>
-                <w:rFonts w:ascii="Arial" w:hAnsi="Arial" w:cs="Arial"/>
-                <w:b/>
-                <w:bCs/>
-                <w:sz w:val="16"/>
-                <w:szCs w:val="16"/>
-              </w:rPr>
-              <w:t>кг</w:t>
             </w:r>
           </w:p>
         </w:tc>

</xml_diff>